<commit_message>
Add the website QR code to both back covers
Rebuild the team's QR code at high resolution in the Guild colours,
with the current logo in the centre and high error correction, and
place it in the middle of both back covers with the web address printed
below it. The code was test-scanned on the final PDFs. Update the
editorial report to match.

Co-Authored-By: Claude Opus 5.5 <noreply@anthropic.com>
Claude-Session: https://claude.ai/code/session_01VkNWz9zCVkDAANuF8jpQYy
</commit_message>
<xml_diff>
--- a/Handbook-Editorial-Report.docx
+++ b/Handbook-Editorial-Report.docx
@@ -11306,7 +11306,19 @@
         <w:rPr>
           <w:rFonts w:ascii="Arial" w:cs="Arial" w:eastAsia="Arial" w:hAnsi="Arial"/>
         </w:rPr>
-        <w:t xml:space="preserve">, the logo, and “First edition 2026”. Both back covers carry the quotation “Words travel worlds. Translators do the driving.” by the translator Anna Rusconi, a one-sentence description, three key features and the logo. The middle of the back cover is left free for the QR code of the team’s website.</w:t>
+        <w:t xml:space="preserve">, the logo, and “First edition 2026”. Both back covers carry the quotation “Words travel worlds. Translators do the driving.” by the translator Anna Rusconi, a one-sentence description, three key features and the logo. The middle of the back cover carries a QR code that links to the Translation Team’s website (translators-guild.vercel.app), with the address also printed in full for readers who cannot scan it.</w:t>
+      </w:r>
+    </w:p>
+    <w:p>
+      <w:pPr>
+        <w:spacing w:after="140" w:line="300"/>
+        <w:jc w:val="both"/>
+      </w:pPr>
+      <w:r>
+        <w:rPr>
+          <w:rFonts w:ascii="Arial" w:cs="Arial" w:eastAsia="Arial" w:hAnsi="Arial"/>
+        </w:rPr>
+        <w:t xml:space="preserve">The QR code was supplied by the team at low resolution and with an older logo. It was rebuilt at high resolution in the Guild colours, with the current logo in the centre and the highest level of error correction, so that it still scans with the logo covering part of it. It was tested with two scanning programs at full size, at small print sizes and on the final PDFs.</w:t>
       </w:r>
     </w:p>
     <w:p>
@@ -13630,7 +13642,7 @@
         <w:rPr>
           <w:rFonts w:ascii="Arial" w:cs="Arial" w:eastAsia="Arial" w:hAnsi="Arial"/>
         </w:rPr>
-        <w:t xml:space="preserve">Add the QR code of the team’s website to the back cover of the chosen edition or editions.</w:t>
+        <w:t xml:space="preserve">Scan the QR code on a printed proof with several phones before the full print run.</w:t>
       </w:r>
     </w:p>
     <w:p>

</xml_diff>

<commit_message>
Print the QR code directly on the back covers and add it inside the book
Drop the white card: the code is centred in the lower middle of each
back cover in a contrasting colour (lavender on Midnight, deep indigo
on Light). Add a last page inside the book with the code and the web
address, and a blank page before the back cover so that the page count
stays even. Update the editorial report.

Co-Authored-By: Claude Opus 5.5 <noreply@anthropic.com>
Claude-Session: https://claude.ai/code/session_01VkNWz9zCVkDAANuF8jpQYy
</commit_message>
<xml_diff>
--- a/Handbook-Editorial-Report.docx
+++ b/Handbook-Editorial-Report.docx
@@ -248,7 +248,7 @@
         <w:rPr>
           <w:rFonts w:ascii="Arial" w:cs="Arial" w:eastAsia="Arial" w:hAnsi="Arial"/>
         </w:rPr>
-        <w:t xml:space="preserve">92 pages, B5 page size (176 × 250 mm), with 9 parts and 27 chapters, followed by practice texts at three levels with an answer key, four checklists, a note on future editions, a glossary of 102 terms and a list of 39 references.</w:t>
+        <w:t xml:space="preserve">94 pages including the covers, B5 page size (176 × 250 mm), with 9 parts and 27 chapters, followed by practice texts at three levels with an answer key, four checklists, a note on future editions, a glossary of 102 terms, a list of 39 references and a page with the QR code of the team’s website.</w:t>
       </w:r>
     </w:p>
     <w:p>
@@ -6740,7 +6740,7 @@
                 <w:sz w:val="19"/>
                 <w:szCs w:val="19"/>
               </w:rPr>
-              <w:t xml:space="preserve">Practice (three levels and answer key), four checklists, future editions, glossary, references.</w:t>
+              <w:t xml:space="preserve">Practice (three levels and answer key), four checklists, future editions, glossary, references, and a final page with the QR code of the team’s website.</w:t>
             </w:r>
           </w:p>
         </w:tc>
@@ -11306,7 +11306,7 @@
         <w:rPr>
           <w:rFonts w:ascii="Arial" w:cs="Arial" w:eastAsia="Arial" w:hAnsi="Arial"/>
         </w:rPr>
-        <w:t xml:space="preserve">, the logo, and “First edition 2026”. Both back covers carry the quotation “Words travel worlds. Translators do the driving.” by the translator Anna Rusconi, a one-sentence description, three key features and the logo. The middle of the back cover carries a QR code that links to the Translation Team’s website (translators-guild.vercel.app), with the address also printed in full for readers who cannot scan it.</w:t>
+        <w:t xml:space="preserve">, the logo, and “First edition 2026”. Both back covers carry the quotation “Words travel worlds. Translators do the driving.” by the translator Anna Rusconi, a one-sentence description, three key features and the logo. The lower middle of the back cover carries a QR code that links to the Translation Team’s website (translators-guild.vercel.app), printed directly on the cover in a contrasting colour (light lavender on the Midnight edition, deep indigo on the Light edition), with the address also printed in full for readers who cannot scan it. The same code appears on the last page inside the book. A blank page before the back cover keeps the page count even for printing.</w:t>
       </w:r>
     </w:p>
     <w:p>

</xml_diff>

<commit_message>
Make the pages lighter for beginners
Remove the part descriptions, cut each chapter introduction to one line,
and remove repeated or unneeded sentences, reducing the running text by
about a third. Every example, key term, practice text and citation is
kept. Give the layout more space (larger text, more line and paragraph
spacing, wider margins). Add the blank page before the back cover only
when it makes the page count even. Update the editorial report.

Co-Authored-By: Claude Opus 5.5 <noreply@anthropic.com>
Claude-Session: https://claude.ai/code/session_01VkNWz9zCVkDAANuF8jpQYy
</commit_message>
<xml_diff>
--- a/Handbook-Editorial-Report.docx
+++ b/Handbook-Editorial-Report.docx
@@ -248,7 +248,7 @@
         <w:rPr>
           <w:rFonts w:ascii="Arial" w:cs="Arial" w:eastAsia="Arial" w:hAnsi="Arial"/>
         </w:rPr>
-        <w:t xml:space="preserve">94 pages including the covers, B5 page size (176 × 250 mm), with 9 parts and 27 chapters, followed by practice texts at three levels with an answer key, four checklists, a note on future editions, a glossary of 102 terms, a list of 39 references and a page with the QR code of the team’s website.</w:t>
+        <w:t xml:space="preserve">98 pages including the covers, B5 page size (176 × 250 mm), with 9 parts and 27 chapters, followed by practice texts at three levels with an answer key, four checklists, a note on future editions, a glossary of 102 terms, a list of 39 references and a page with the QR code of the team’s website.</w:t>
       </w:r>
     </w:p>
     <w:p>
@@ -9856,7 +9856,124 @@
         <w:pStyle w:val="Heading2"/>
       </w:pPr>
       <w:r>
-        <w:t xml:space="preserve">8.3 Removed before publication</w:t>
+        <w:t xml:space="preserve">8.3 Removed to make the pages lighter</w:t>
+      </w:r>
+    </w:p>
+    <w:p>
+      <w:pPr>
+        <w:spacing w:after="140" w:line="300"/>
+        <w:jc w:val="both"/>
+      </w:pPr>
+      <w:r>
+        <w:rPr>
+          <w:rFonts w:ascii="Arial" w:cs="Arial" w:eastAsia="Arial" w:hAnsi="Arial"/>
+        </w:rPr>
+        <w:t xml:space="preserve">After the team found the pages too dense for beginners, the running text was reduced by about a third, without removing any example, key term, practice text, checklist item or citation:</w:t>
+      </w:r>
+    </w:p>
+    <w:p>
+      <w:pPr>
+        <w:pStyle w:val="ListParagraph"/>
+        <w:numPr>
+          <w:ilvl w:val="0"/>
+          <w:numId w:val="2"/>
+        </w:numPr>
+        <w:spacing w:after="80" w:line="290"/>
+      </w:pPr>
+      <w:r>
+        <w:rPr>
+          <w:rFonts w:ascii="Arial" w:cs="Arial" w:eastAsia="Arial" w:hAnsi="Arial"/>
+        </w:rPr>
+        <w:t xml:space="preserve">The italic descriptions under each part heading were removed. The part title is followed directly by its first chapter.</w:t>
+      </w:r>
+    </w:p>
+    <w:p>
+      <w:pPr>
+        <w:pStyle w:val="ListParagraph"/>
+        <w:numPr>
+          <w:ilvl w:val="0"/>
+          <w:numId w:val="2"/>
+        </w:numPr>
+        <w:spacing w:after="80" w:line="290"/>
+      </w:pPr>
+      <w:r>
+        <w:rPr>
+          <w:rFonts w:ascii="Arial" w:cs="Arial" w:eastAsia="Arial" w:hAnsi="Arial"/>
+        </w:rPr>
+        <w:t xml:space="preserve">Each chapter introduction was reduced to one short line saying what the chapter covers.</w:t>
+      </w:r>
+    </w:p>
+    <w:p>
+      <w:pPr>
+        <w:pStyle w:val="ListParagraph"/>
+        <w:numPr>
+          <w:ilvl w:val="0"/>
+          <w:numId w:val="2"/>
+        </w:numPr>
+        <w:spacing w:after="80" w:line="290"/>
+      </w:pPr>
+      <w:r>
+        <w:rPr>
+          <w:rFonts w:ascii="Arial" w:cs="Arial" w:eastAsia="Arial" w:hAnsi="Arial"/>
+        </w:rPr>
+        <w:t xml:space="preserve">Sentences that repeated a heading, a key-term definition, an example or another paragraph were removed, and long paragraphs were shortened to one to three sentences.</w:t>
+      </w:r>
+    </w:p>
+    <w:p>
+      <w:pPr>
+        <w:pStyle w:val="ListParagraph"/>
+        <w:numPr>
+          <w:ilvl w:val="0"/>
+          <w:numId w:val="2"/>
+        </w:numPr>
+        <w:spacing w:after="80" w:line="290"/>
+      </w:pPr>
+      <w:r>
+        <w:rPr>
+          <w:rFonts w:ascii="Arial" w:cs="Arial" w:eastAsia="Arial" w:hAnsi="Arial"/>
+        </w:rPr>
+        <w:t xml:space="preserve">Long key-term definitions and long answers to the “Try it” questions were shortened.</w:t>
+      </w:r>
+    </w:p>
+    <w:p>
+      <w:pPr>
+        <w:pStyle w:val="ListParagraph"/>
+        <w:numPr>
+          <w:ilvl w:val="0"/>
+          <w:numId w:val="2"/>
+        </w:numPr>
+        <w:spacing w:after="80" w:line="290"/>
+      </w:pPr>
+      <w:r>
+        <w:rPr>
+          <w:rFonts w:ascii="Arial" w:cs="Arial" w:eastAsia="Arial" w:hAnsi="Arial"/>
+        </w:rPr>
+        <w:t xml:space="preserve">The page layout was given more space: slightly larger text, more space between lines and paragraphs, and wider margins.</w:t>
+      </w:r>
+    </w:p>
+    <w:p>
+      <w:pPr>
+        <w:spacing w:after="60"/>
+      </w:pPr>
+    </w:p>
+    <w:p>
+      <w:pPr>
+        <w:spacing w:after="140" w:line="300"/>
+        <w:jc w:val="both"/>
+      </w:pPr>
+      <w:r>
+        <w:rPr>
+          <w:rFonts w:ascii="Arial" w:cs="Arial" w:eastAsia="Arial" w:hAnsi="Arial"/>
+        </w:rPr>
+        <w:t xml:space="preserve">A check after the revision confirmed that all 313 Arabic examples and all 39 cited sources are still in the handbook.</w:t>
+      </w:r>
+    </w:p>
+    <w:p>
+      <w:pPr>
+        <w:pStyle w:val="Heading2"/>
+      </w:pPr>
+      <w:r>
+        <w:t xml:space="preserve">8.4 Removed before publication</w:t>
       </w:r>
     </w:p>
     <w:p>
@@ -11134,7 +11251,7 @@
         <w:rPr>
           <w:rFonts w:ascii="Arial" w:cs="Arial" w:eastAsia="Arial" w:hAnsi="Arial"/>
         </w:rPr>
-        <w:t xml:space="preserve">White pages with dark text. Headings are in a serif typeface and the body text in a sans-serif typeface. Arabic is set right to left in an Arabic typeface.</w:t>
+        <w:t xml:space="preserve">White pages with dark text, generous line spacing and wide margins, so that each page carries a moderate amount of text. Headings are in a serif typeface and the body text in a sans-serif typeface. Arabic is set right to left in an Arabic typeface.</w:t>
       </w:r>
     </w:p>
     <w:p>
@@ -11306,7 +11423,7 @@
         <w:rPr>
           <w:rFonts w:ascii="Arial" w:cs="Arial" w:eastAsia="Arial" w:hAnsi="Arial"/>
         </w:rPr>
-        <w:t xml:space="preserve">, the logo, and “First edition 2026”. Both back covers carry the quotation “Words travel worlds. Translators do the driving.” by the translator Anna Rusconi, a one-sentence description, three key features and the logo. The lower middle of the back cover carries a QR code that links to the Translation Team’s website (translators-guild.vercel.app), printed directly on the cover in a contrasting colour (light lavender on the Midnight edition, deep indigo on the Light edition), with the address also printed in full for readers who cannot scan it. The same code appears on the last page inside the book. A blank page before the back cover keeps the page count even for printing.</w:t>
+        <w:t xml:space="preserve">, the logo, and “First edition 2026”. Both back covers carry the quotation “Words travel worlds. Translators do the driving.” by the translator Anna Rusconi, a one-sentence description, three key features and the logo. The lower middle of the back cover carries a QR code that links to the Translation Team’s website (translators-guild.vercel.app), printed directly on the cover in a contrasting colour (light lavender on the Midnight edition, deep indigo on the Light edition), with the address also printed in full for readers who cannot scan it. The same code appears on the last page inside the book. When needed, a blank page is added before the back cover so that the page count is even for printing.</w:t>
       </w:r>
     </w:p>
     <w:p>

</xml_diff>

<commit_message>
Correct the handbook after a full expert review
Review the whole book in both languages and apply 192 corrections of
concept, Arabic, examples, consistency, English, neutrality and
citations. Among them: a freelancer given as a commissioned translator,
the rule on Arabic word order, the Arabic equivalent of "is", zakat and
tayammum, and the Arabic terms for lexical creation, form and modulation.

Add a correction log listing every change and 18 points to check
against the printed sources, and update the editorial report.

Co-Authored-By: Claude Opus 5.5 <noreply@anthropic.com>
Claude-Session: https://claude.ai/code/session_01VkNWz9zCVkDAANuF8jpQYy
</commit_message>
<xml_diff>
--- a/Handbook-Editorial-Report.docx
+++ b/Handbook-Editorial-Report.docx
@@ -248,7 +248,7 @@
         <w:rPr>
           <w:rFonts w:ascii="Arial" w:cs="Arial" w:eastAsia="Arial" w:hAnsi="Arial"/>
         </w:rPr>
-        <w:t xml:space="preserve">98 pages including the covers, B5 page size (176 × 250 mm), with 9 parts and 27 chapters, followed by practice texts at three levels with an answer key, four checklists, a note on future editions, a glossary of 102 terms, a list of 39 references and a page with the QR code of the team’s website.</w:t>
+        <w:t xml:space="preserve">102 pages including the covers, B5 page size (176 × 250 mm), with 9 parts and 27 chapters, followed by practice texts at three levels with an answer key, four checklists, a note on future editions, a glossary of 103 terms, a list of 39 references and a page with the QR code of the team’s website.</w:t>
       </w:r>
     </w:p>
     <w:p>
@@ -2443,7 +2443,7 @@
                 <w:sz w:val="19"/>
                 <w:szCs w:val="19"/>
               </w:rPr>
-              <w:t xml:space="preserve">Every chapter opens with a list of key terms, each with its Arabic equivalent and a short definition. The glossary is compiled from these lists and has 102 terms, each with the chapter where it is explained.</w:t>
+              <w:t xml:space="preserve">Every chapter opens with a list of key terms, each with its Arabic equivalent and a short definition. The glossary is compiled from these lists and has 103 terms, each with the chapter where it is explained.</w:t>
             </w:r>
           </w:p>
         </w:tc>
@@ -8880,7 +8880,7 @@
         <w:rPr>
           <w:rFonts w:ascii="Arial" w:cs="Arial" w:eastAsia="Arial" w:hAnsi="Arial"/>
         </w:rPr>
-        <w:t xml:space="preserve">Two Arabic equivalents were changed to the more common form. For “governing law”, the handbook gives the more common form and lists the draft’s form as an alternative. For “jet lag”, the handbook uses the more common form only. The team may prefer the draft’s forms (Section 12). The same Arabic form for “governing law” is now used in every chapter.</w:t>
+        <w:t xml:space="preserve">Two Arabic equivalents were changed to the more common form. For “governing law”, the handbook gives the more common form and lists the draft’s form as an alternative. For “jet lag”, the handbook now gives a descriptive translation that keeps the idea of the time difference. The team may prefer the draft’s forms (Section 12). The same Arabic form for “governing law” is now used in every chapter.</w:t>
       </w:r>
     </w:p>
     <w:p>
@@ -9973,7 +9973,27 @@
         <w:pStyle w:val="Heading2"/>
       </w:pPr>
       <w:r>
-        <w:t xml:space="preserve">8.4 Removed before publication</w:t>
+        <w:t xml:space="preserve">8.4 Expert review before publication</w:t>
+      </w:r>
+    </w:p>
+    <w:p>
+      <w:pPr>
+        <w:spacing w:after="140" w:line="300"/>
+        <w:jc w:val="both"/>
+      </w:pPr>
+      <w:r>
+        <w:rPr>
+          <w:rFonts w:ascii="Arial" w:cs="Arial" w:eastAsia="Arial" w:hAnsi="Arial"/>
+        </w:rPr>
+        <w:t xml:space="preserve">An error found on the first page of Chapter 1 (a freelancer given as an example of a commissioned translator) led to a full expert review of the book in both languages. The review checked concepts and facts, Arabic language and terminology, examples, consistency, repetition, English, neutrality and citations. 192 corrections were made, 23 of them of high importance. Examples of the most important corrections: the rule on Arabic word order (both verb-first and subject-first sentences are correct), the Arabic equivalent of “is”, the explanations of zakat and tayammum, the Arabic terms for lexical creation, lexicalisation, form and modulation, the definition of a terminologist, and several examples that did not illustrate the point they were given for. Every correction and its reason is listed in a separate document, the Correction Log, together with 18 points that must be checked against the printed sources.</w:t>
+      </w:r>
+    </w:p>
+    <w:p>
+      <w:pPr>
+        <w:pStyle w:val="Heading2"/>
+      </w:pPr>
+      <w:r>
+        <w:t xml:space="preserve">8.5 Removed before publication</w:t>
       </w:r>
     </w:p>
     <w:p>
@@ -13680,6 +13700,22 @@
           <w:rFonts w:ascii="Arial" w:cs="Arial" w:eastAsia="Arial" w:hAnsi="Arial"/>
         </w:rPr>
         <w:t xml:space="preserve">Have a qualified Arabic–English translator proofread all Arabic in the handbook.</w:t>
+      </w:r>
+    </w:p>
+    <w:p>
+      <w:pPr>
+        <w:pStyle w:val="ListParagraph"/>
+        <w:numPr>
+          <w:ilvl w:val="0"/>
+          <w:numId w:val="6"/>
+        </w:numPr>
+        <w:spacing w:after="80" w:line="290"/>
+      </w:pPr>
+      <w:r>
+        <w:rPr>
+          <w:rFonts w:ascii="Arial" w:cs="Arial" w:eastAsia="Arial" w:hAnsi="Arial"/>
+        </w:rPr>
+        <w:t xml:space="preserve">Check the 18 points listed in Section 4 of the Correction Log against the printed sources.</w:t>
       </w:r>
     </w:p>
     <w:p>

</xml_diff>

<commit_message>
Shorten the handbook to 86 pages
Remove the practice section, answer key, checklists and note on future
editions, and the reference used only in the practice section. Take the
scholars' names out of the running text while keeping each citation in
brackets. Move the acknowledgements into the preface and the
abbreviations into "How to use this handbook", and fit the contents on
one page. Update the back cover, the editorial report and the
correction log.

Co-Authored-By: Claude Opus 5.5 <noreply@anthropic.com>
Claude-Session: https://claude.ai/code/session_01VkNWz9zCVkDAANuF8jpQYy
</commit_message>
<xml_diff>
--- a/Handbook-Editorial-Report.docx
+++ b/Handbook-Editorial-Report.docx
@@ -248,7 +248,7 @@
         <w:rPr>
           <w:rFonts w:ascii="Arial" w:cs="Arial" w:eastAsia="Arial" w:hAnsi="Arial"/>
         </w:rPr>
-        <w:t xml:space="preserve">102 pages including the covers, B5 page size (176 × 250 mm), with 9 parts and 27 chapters, followed by practice texts at three levels with an answer key, four checklists, a note on future editions, a glossary of 103 terms, a list of 39 references and a page with the QR code of the team’s website.</w:t>
+        <w:t xml:space="preserve">86 pages including the covers, B5 page size (176 × 250 mm), with 9 parts and 27 chapters, followed by a glossary of 103 terms, a list of 38 references and a page with the QR code of the team’s website.</w:t>
       </w:r>
     </w:p>
     <w:p>
@@ -1295,7 +1295,7 @@
         <w:rPr>
           <w:rFonts w:ascii="Arial" w:cs="Arial" w:eastAsia="Arial" w:hAnsi="Arial"/>
         </w:rPr>
-        <w:t xml:space="preserve">Published works on translation, linguistics and terminology were used to provide definitions, to support the draft’s ideas with recognised sources, and to check facts. All 39 works are cited in the text and listed in the references. No text from websites was copied into the handbook. Two online terminology databases (UNTERM and Arabterm) are recommended to readers as tools and are cited as such.</w:t>
+        <w:t xml:space="preserve">Published works on translation, linguistics and terminology were used to provide definitions, to support the draft’s ideas with recognised sources, and to check facts. All 38 works are cited in the text and listed in the references. No text from websites was copied into the handbook. Two online terminology databases (UNTERM and Arabterm) are recommended to readers as tools and are cited as such.</w:t>
       </w:r>
     </w:p>
     <w:p>
@@ -1327,7 +1327,7 @@
         <w:rPr>
           <w:rFonts w:ascii="Arial" w:cs="Arial" w:eastAsia="Arial" w:hAnsi="Arial"/>
         </w:rPr>
-        <w:t xml:space="preserve"> The chapter list, the checklists, the practice section and the glossary all come from the notes.</w:t>
+        <w:t xml:space="preserve"> The chapter list and the glossary come from the notes.</w:t>
       </w:r>
     </w:p>
     <w:p>
@@ -2633,7 +2633,7 @@
                 <w:sz w:val="19"/>
                 <w:szCs w:val="19"/>
               </w:rPr>
-              <w:t xml:space="preserve">Done</w:t>
+              <w:t xml:space="preserve">Removed</w:t>
             </w:r>
           </w:p>
         </w:tc>
@@ -2663,7 +2663,7 @@
                 <w:sz w:val="19"/>
                 <w:szCs w:val="19"/>
               </w:rPr>
-              <w:t xml:space="preserve">Practice</w:t>
+              <w:t xml:space="preserve">–</w:t>
             </w:r>
           </w:p>
         </w:tc>
@@ -2693,7 +2693,7 @@
                 <w:sz w:val="19"/>
                 <w:szCs w:val="19"/>
               </w:rPr>
-              <w:t xml:space="preserve">Level 1: sentences in both directions and error correction. Level 2: a legal and human-rights text, classical Arabic poetry and English poetry. Level 3: two news texts, with instructions to use the checklists and the risk matrix.</w:t>
+              <w:t xml:space="preserve">A practice section at three levels was written and then removed at the team’s request to keep the handbook short (Section 8.5). Every chapter still has a “Try it” exercise with answers.</w:t>
             </w:r>
           </w:p>
         </w:tc>
@@ -2913,7 +2913,7 @@
                 <w:sz w:val="19"/>
                 <w:szCs w:val="19"/>
               </w:rPr>
-              <w:t xml:space="preserve">Practice, Level 3</w:t>
+              <w:t xml:space="preserve">–</w:t>
             </w:r>
           </w:p>
         </w:tc>
@@ -2943,7 +2943,7 @@
                 <w:sz w:val="19"/>
                 <w:szCs w:val="19"/>
               </w:rPr>
-              <w:t xml:space="preserve">The two news texts were written for the handbook and are labelled as such. Authentic texts need permission from their publishers.</w:t>
+              <w:t xml:space="preserve">The practice section, where news texts would have been used, was removed. Authentic texts would also need permission from their publishers.</w:t>
             </w:r>
           </w:p>
         </w:tc>
@@ -3163,7 +3163,7 @@
                 <w:sz w:val="19"/>
                 <w:szCs w:val="19"/>
               </w:rPr>
-              <w:t xml:space="preserve">Chapters 11 and 18; Practice</w:t>
+              <w:t xml:space="preserve">Chapters 11, 14 and 18</w:t>
             </w:r>
           </w:p>
         </w:tc>
@@ -3508,7 +3508,7 @@
                 <w:sz w:val="19"/>
                 <w:szCs w:val="19"/>
               </w:rPr>
-              <w:t xml:space="preserve">Done</w:t>
+              <w:t xml:space="preserve">Removed</w:t>
             </w:r>
           </w:p>
         </w:tc>
@@ -3538,7 +3538,7 @@
                 <w:sz w:val="19"/>
                 <w:szCs w:val="19"/>
               </w:rPr>
-              <w:t xml:space="preserve">Checklists</w:t>
+              <w:t xml:space="preserve">–</w:t>
             </w:r>
           </w:p>
         </w:tc>
@@ -3568,7 +3568,7 @@
                 <w:sz w:val="19"/>
                 <w:szCs w:val="19"/>
               </w:rPr>
-              <w:t xml:space="preserve">The translation process, an analysis worksheet, words and points of view, and the commentary.</w:t>
+              <w:t xml:space="preserve">Four checklists were written and then removed at the team’s request to keep the handbook short (Section 8.5). The analysis checklist in Chapter 17 remains.</w:t>
             </w:r>
           </w:p>
         </w:tc>
@@ -3693,7 +3693,7 @@
                 <w:sz w:val="19"/>
                 <w:szCs w:val="19"/>
               </w:rPr>
-              <w:t xml:space="preserve">The three questions form the translation brief and are used again in the practice section.</w:t>
+              <w:t xml:space="preserve">The three questions form the translation brief.</w:t>
             </w:r>
           </w:p>
         </w:tc>
@@ -4008,7 +4008,7 @@
                 <w:sz w:val="19"/>
                 <w:szCs w:val="19"/>
               </w:rPr>
-              <w:t xml:space="preserve">Partly done</w:t>
+              <w:t xml:space="preserve">Removed</w:t>
             </w:r>
           </w:p>
         </w:tc>
@@ -4038,7 +4038,7 @@
                 <w:sz w:val="19"/>
                 <w:szCs w:val="19"/>
               </w:rPr>
-              <w:t xml:space="preserve">Future editions</w:t>
+              <w:t xml:space="preserve">–</w:t>
             </w:r>
           </w:p>
         </w:tc>
@@ -4068,7 +4068,7 @@
                 <w:sz w:val="19"/>
                 <w:szCs w:val="19"/>
               </w:rPr>
-              <w:t xml:space="preserve">Lists the planned Arabic version, more authentic news texts, subtitling exercises with film clips, and chapters on interpreting and on legal and medical translation. The notes do not specify the audiences, so none are named.</w:t>
+              <w:t xml:space="preserve">A note on future editions was written and then removed at the team’s request to keep the handbook short (Section 8.5).</w:t>
             </w:r>
           </w:p>
         </w:tc>
@@ -4680,7 +4680,7 @@
                 <w:sz w:val="19"/>
                 <w:szCs w:val="19"/>
               </w:rPr>
-              <w:t xml:space="preserve">Chapter 19; Checklist 3</w:t>
+              <w:t xml:space="preserve">Chapter 19</w:t>
             </w:r>
           </w:p>
         </w:tc>
@@ -4775,7 +4775,7 @@
                 <w:sz w:val="19"/>
                 <w:szCs w:val="19"/>
               </w:rPr>
-              <w:t xml:space="preserve">Partly done</w:t>
+              <w:t xml:space="preserve">Removed</w:t>
             </w:r>
           </w:p>
         </w:tc>
@@ -4805,7 +4805,7 @@
                 <w:sz w:val="19"/>
                 <w:szCs w:val="19"/>
               </w:rPr>
-              <w:t xml:space="preserve">Checklist 3</w:t>
+              <w:t xml:space="preserve">–</w:t>
             </w:r>
           </w:p>
         </w:tc>
@@ -4835,7 +4835,7 @@
                 <w:sz w:val="19"/>
                 <w:szCs w:val="19"/>
               </w:rPr>
-              <w:t xml:space="preserve">The Fairclough checklist is included. The checklist based on Dr Abdullah’s framework is not included because the framework was not received.</w:t>
+              <w:t xml:space="preserve">A Fairclough checklist was written and later removed with the other checklists (Section 8.5). The checklist based on Dr Abdullah’s framework was not written because the framework was not received.</w:t>
             </w:r>
           </w:p>
         </w:tc>
@@ -5180,7 +5180,7 @@
                 <w:sz w:val="19"/>
                 <w:szCs w:val="19"/>
               </w:rPr>
-              <w:t xml:space="preserve">Answer key; every chapter</w:t>
+              <w:t xml:space="preserve">Every chapter</w:t>
             </w:r>
           </w:p>
         </w:tc>
@@ -5210,7 +5210,7 @@
                 <w:sz w:val="19"/>
                 <w:szCs w:val="19"/>
               </w:rPr>
-              <w:t xml:space="preserve">Every “Try it” exercise and every practice item has an answer with a short explanation. Level 3 has guidance instead of a single model answer.</w:t>
+              <w:t xml:space="preserve">Every “Try it” exercise has its answers directly after it. The separate answer key was removed with the practice section.</w:t>
             </w:r>
           </w:p>
         </w:tc>
@@ -5335,7 +5335,7 @@
                 <w:sz w:val="19"/>
                 <w:szCs w:val="19"/>
               </w:rPr>
-              <w:t xml:space="preserve">Nine parts and 27 chapters, with the placement of the tips, the practice section and the glossary decided as described in Section 6.</w:t>
+              <w:t xml:space="preserve">Nine parts and 27 chapters, with the placement of the tips and the glossary decided as described in Section 6.</w:t>
             </w:r>
           </w:p>
         </w:tc>
@@ -5525,7 +5525,7 @@
                 <w:sz w:val="19"/>
                 <w:szCs w:val="19"/>
               </w:rPr>
-              <w:t xml:space="preserve">Done</w:t>
+              <w:t xml:space="preserve">Noted</w:t>
             </w:r>
           </w:p>
         </w:tc>
@@ -5555,7 +5555,7 @@
                 <w:sz w:val="19"/>
                 <w:szCs w:val="19"/>
               </w:rPr>
-              <w:t xml:space="preserve">Future editions</w:t>
+              <w:t xml:space="preserve">–</w:t>
             </w:r>
           </w:p>
         </w:tc>
@@ -5585,7 +5585,7 @@
                 <w:sz w:val="19"/>
                 <w:szCs w:val="19"/>
               </w:rPr>
-              <w:t xml:space="preserve">The planned Arabic version is listed.</w:t>
+              <w:t xml:space="preserve">Recorded in this report; the note on future editions was removed from the handbook.</w:t>
             </w:r>
           </w:p>
         </w:tc>
@@ -6740,7 +6740,7 @@
                 <w:sz w:val="19"/>
                 <w:szCs w:val="19"/>
               </w:rPr>
-              <w:t xml:space="preserve">Practice (three levels and answer key), four checklists, future editions, glossary, references, and a final page with the QR code of the team’s website.</w:t>
+              <w:t xml:space="preserve">Glossary, references, and a final page with the QR code of the team’s website.</w:t>
             </w:r>
           </w:p>
         </w:tc>
@@ -6770,7 +6770,7 @@
                 <w:sz w:val="19"/>
                 <w:szCs w:val="19"/>
               </w:rPr>
-              <w:t xml:space="preserve">Exercises and reference material that draw on the whole book.</w:t>
+              <w:t xml:space="preserve">Reference material that draws on the whole book.</w:t>
             </w:r>
           </w:p>
         </w:tc>
@@ -9868,7 +9868,7 @@
         <w:rPr>
           <w:rFonts w:ascii="Arial" w:cs="Arial" w:eastAsia="Arial" w:hAnsi="Arial"/>
         </w:rPr>
-        <w:t xml:space="preserve">After the team found the pages too dense for beginners, the running text was reduced by about a third, without removing any example, key term, practice text, checklist item or citation:</w:t>
+        <w:t xml:space="preserve">After the team found the pages too dense for beginners, the running text was reduced by about a third, without removing any example, key term or citation:</w:t>
       </w:r>
     </w:p>
     <w:p>
@@ -9993,7 +9993,128 @@
         <w:pStyle w:val="Heading2"/>
       </w:pPr>
       <w:r>
-        <w:t xml:space="preserve">8.5 Removed before publication</w:t>
+        <w:t xml:space="preserve">8.5 Removed to shorten the handbook</w:t>
+      </w:r>
+    </w:p>
+    <w:p>
+      <w:pPr>
+        <w:spacing w:after="140" w:line="300"/>
+        <w:jc w:val="both"/>
+      </w:pPr>
+      <w:r>
+        <w:rPr>
+          <w:rFonts w:ascii="Arial" w:cs="Arial" w:eastAsia="Arial" w:hAnsi="Arial"/>
+        </w:rPr>
+        <w:t xml:space="preserve">At the team’s request, the handbook was shortened from 102 to 86 pages by removing material that a beginner does not need in order to use the book:</w:t>
+      </w:r>
+    </w:p>
+    <w:p>
+      <w:pPr>
+        <w:pStyle w:val="ListParagraph"/>
+        <w:numPr>
+          <w:ilvl w:val="0"/>
+          <w:numId w:val="2"/>
+        </w:numPr>
+        <w:spacing w:after="80" w:line="290"/>
+      </w:pPr>
+      <w:r>
+        <w:rPr>
+          <w:rFonts w:ascii="Arial" w:cs="Arial" w:eastAsia="Arial" w:hAnsi="Arial"/>
+        </w:rPr>
+        <w:t xml:space="preserve">The practice section (three levels of practice texts) and its answer key. Every chapter keeps its “Try it” exercise with answers.</w:t>
+      </w:r>
+    </w:p>
+    <w:p>
+      <w:pPr>
+        <w:pStyle w:val="ListParagraph"/>
+        <w:numPr>
+          <w:ilvl w:val="0"/>
+          <w:numId w:val="2"/>
+        </w:numPr>
+        <w:spacing w:after="80" w:line="290"/>
+      </w:pPr>
+      <w:r>
+        <w:rPr>
+          <w:rFonts w:ascii="Arial" w:cs="Arial" w:eastAsia="Arial" w:hAnsi="Arial"/>
+        </w:rPr>
+        <w:t xml:space="preserve">The four checklists at the end of the book.</w:t>
+      </w:r>
+    </w:p>
+    <w:p>
+      <w:pPr>
+        <w:pStyle w:val="ListParagraph"/>
+        <w:numPr>
+          <w:ilvl w:val="0"/>
+          <w:numId w:val="2"/>
+        </w:numPr>
+        <w:spacing w:after="80" w:line="290"/>
+      </w:pPr>
+      <w:r>
+        <w:rPr>
+          <w:rFonts w:ascii="Arial" w:cs="Arial" w:eastAsia="Arial" w:hAnsi="Arial"/>
+        </w:rPr>
+        <w:t xml:space="preserve">The note on future editions.</w:t>
+      </w:r>
+    </w:p>
+    <w:p>
+      <w:pPr>
+        <w:pStyle w:val="ListParagraph"/>
+        <w:numPr>
+          <w:ilvl w:val="0"/>
+          <w:numId w:val="2"/>
+        </w:numPr>
+        <w:spacing w:after="80" w:line="290"/>
+      </w:pPr>
+      <w:r>
+        <w:rPr>
+          <w:rFonts w:ascii="Arial" w:cs="Arial" w:eastAsia="Arial" w:hAnsi="Arial"/>
+        </w:rPr>
+        <w:t xml:space="preserve">The names of scholars in the running text. Each idea taken from a published work keeps its short citation in brackets, and the full sources remain in the references, so that the handbook meets academic standards on attribution.</w:t>
+      </w:r>
+    </w:p>
+    <w:p>
+      <w:pPr>
+        <w:pStyle w:val="ListParagraph"/>
+        <w:numPr>
+          <w:ilvl w:val="0"/>
+          <w:numId w:val="2"/>
+        </w:numPr>
+        <w:spacing w:after="80" w:line="290"/>
+      </w:pPr>
+      <w:r>
+        <w:rPr>
+          <w:rFonts w:ascii="Arial" w:cs="Arial" w:eastAsia="Arial" w:hAnsi="Arial"/>
+        </w:rPr>
+        <w:t xml:space="preserve">The separate page for the acknowledgements, which now closes the preface, and the separate page for the abbreviations, which now follow “How to use this handbook”.</w:t>
+      </w:r>
+    </w:p>
+    <w:p>
+      <w:pPr>
+        <w:pStyle w:val="ListParagraph"/>
+        <w:numPr>
+          <w:ilvl w:val="0"/>
+          <w:numId w:val="2"/>
+        </w:numPr>
+        <w:spacing w:after="80" w:line="290"/>
+      </w:pPr>
+      <w:r>
+        <w:rPr>
+          <w:rFonts w:ascii="Arial" w:cs="Arial" w:eastAsia="Arial" w:hAnsi="Arial"/>
+        </w:rPr>
+        <w:t xml:space="preserve">One reference that was used only in the practice section (the Universal Declaration of Human Rights).</w:t>
+      </w:r>
+    </w:p>
+    <w:p>
+      <w:pPr>
+        <w:spacing w:after="60"/>
+      </w:pPr>
+    </w:p>
+    <w:p>
+      <w:pPr>
+        <w:pStyle w:val="Heading2"/>
+      </w:pPr>
+      <w:r>
+        <w:t xml:space="preserve">8.6 Removed before publication</w:t>
       </w:r>
     </w:p>
     <w:p>
@@ -11076,7 +11197,7 @@
                 <w:sz w:val="19"/>
                 <w:szCs w:val="19"/>
               </w:rPr>
-              <w:t xml:space="preserve">Practice section, answer key, four checklists, glossary and references</w:t>
+              <w:t xml:space="preserve">Glossary and references</w:t>
             </w:r>
           </w:p>
         </w:tc>
@@ -11137,101 +11258,6 @@
                 <w:szCs w:val="19"/>
               </w:rPr>
               <w:t xml:space="preserve">Requested in the notes.</w:t>
-            </w:r>
-          </w:p>
-        </w:tc>
-      </w:tr>
-      <w:tr>
-        <w:trPr>
-          <w:cantSplit/>
-        </w:trPr>
-        <w:tc>
-          <w:tcPr>
-            <w:tcW w:type="dxa" w:w="2721"/>
-            <w:tcBorders>
-              <w:top w:val="single" w:color="000000" w:sz="4"/>
-              <w:left w:val="single" w:color="000000" w:sz="4"/>
-              <w:bottom w:val="single" w:color="000000" w:sz="4"/>
-              <w:right w:val="single" w:color="000000" w:sz="4"/>
-            </w:tcBorders>
-            <w:tcMar>
-              <w:top w:type="dxa" w:w="60"/>
-              <w:left w:type="dxa" w:w="100"/>
-              <w:bottom w:type="dxa" w:w="60"/>
-              <w:right w:type="dxa" w:w="100"/>
-            </w:tcMar>
-          </w:tcPr>
-          <w:p>
-            <w:pPr>
-              <w:spacing w:after="0" w:line="260"/>
-            </w:pPr>
-            <w:r>
-              <w:rPr>
-                <w:rFonts w:ascii="Arial" w:cs="Arial" w:eastAsia="Arial" w:hAnsi="Arial"/>
-                <w:sz w:val="19"/>
-                <w:szCs w:val="19"/>
-              </w:rPr>
-              <w:t xml:space="preserve">Future editions</w:t>
-            </w:r>
-          </w:p>
-        </w:tc>
-        <w:tc>
-          <w:tcPr>
-            <w:tcW w:type="dxa" w:w="1633"/>
-            <w:tcBorders>
-              <w:top w:val="single" w:color="000000" w:sz="4"/>
-              <w:left w:val="single" w:color="000000" w:sz="4"/>
-              <w:bottom w:val="single" w:color="000000" w:sz="4"/>
-              <w:right w:val="single" w:color="000000" w:sz="4"/>
-            </w:tcBorders>
-            <w:tcMar>
-              <w:top w:type="dxa" w:w="60"/>
-              <w:left w:type="dxa" w:w="100"/>
-              <w:bottom w:type="dxa" w:w="60"/>
-              <w:right w:type="dxa" w:w="100"/>
-            </w:tcMar>
-          </w:tcPr>
-          <w:p>
-            <w:pPr>
-              <w:spacing w:after="0" w:line="260"/>
-            </w:pPr>
-            <w:r>
-              <w:rPr>
-                <w:rFonts w:ascii="Arial" w:cs="Arial" w:eastAsia="Arial" w:hAnsi="Arial"/>
-                <w:sz w:val="19"/>
-                <w:szCs w:val="19"/>
-              </w:rPr>
-              <w:t xml:space="preserve">Back matter</w:t>
-            </w:r>
-          </w:p>
-        </w:tc>
-        <w:tc>
-          <w:tcPr>
-            <w:tcW w:type="dxa" w:w="4717"/>
-            <w:tcBorders>
-              <w:top w:val="single" w:color="000000" w:sz="4"/>
-              <w:left w:val="single" w:color="000000" w:sz="4"/>
-              <w:bottom w:val="single" w:color="000000" w:sz="4"/>
-              <w:right w:val="single" w:color="000000" w:sz="4"/>
-            </w:tcBorders>
-            <w:tcMar>
-              <w:top w:type="dxa" w:w="60"/>
-              <w:left w:type="dxa" w:w="100"/>
-              <w:bottom w:type="dxa" w:w="60"/>
-              <w:right w:type="dxa" w:w="100"/>
-            </w:tcMar>
-          </w:tcPr>
-          <w:p>
-            <w:pPr>
-              <w:spacing w:after="0" w:line="260"/>
-            </w:pPr>
-            <w:r>
-              <w:rPr>
-                <w:rFonts w:ascii="Arial" w:cs="Arial" w:eastAsia="Arial" w:hAnsi="Arial"/>
-                <w:sz w:val="19"/>
-                <w:szCs w:val="19"/>
-              </w:rPr>
-              <w:t xml:space="preserve">Requested in the notes (paragraph 38).</w:t>
             </w:r>
           </w:p>
         </w:tc>
@@ -13932,13 +13958,13 @@
           <w:b/>
           <w:bCs/>
         </w:rPr>
-        <w:t xml:space="preserve">Dr Abdullah’s framework.</w:t>
+        <w:t xml:space="preserve">Authentic news texts.</w:t>
       </w:r>
       <w:r>
         <w:rPr>
           <w:rFonts w:ascii="Arial" w:cs="Arial" w:eastAsia="Arial" w:hAnsi="Arial"/>
         </w:rPr>
-        <w:t xml:space="preserve"> A checklist based on it can be added once the framework is received.</w:t>
+        <w:t xml:space="preserve"> Whether to replace the two news texts written for the handbook with published articles, which requires the publishers’ permission.</w:t>
       </w:r>
     </w:p>
     <w:p>
@@ -13956,13 +13982,13 @@
           <w:b/>
           <w:bCs/>
         </w:rPr>
-        <w:t xml:space="preserve">Authentic news texts.</w:t>
+        <w:t xml:space="preserve">Materials not yet received.</w:t>
       </w:r>
       <w:r>
         <w:rPr>
           <w:rFonts w:ascii="Arial" w:cs="Arial" w:eastAsia="Arial" w:hAnsi="Arial"/>
         </w:rPr>
-        <w:t xml:space="preserve"> Whether to replace the two news texts written for the handbook with published articles, which requires the publishers’ permission.</w:t>
+        <w:t xml:space="preserve"> Whether to add material from the 180, 182, 386 and Analysis texts, “the book”, Loulwah’s notes and the other contributions listed in Section 3.2 to this edition or to a later one.</w:t>
       </w:r>
     </w:p>
     <w:p>
@@ -13980,37 +14006,13 @@
           <w:b/>
           <w:bCs/>
         </w:rPr>
-        <w:t xml:space="preserve">Materials not yet received.</w:t>
+        <w:t xml:space="preserve">Fairclough.</w:t>
       </w:r>
       <w:r>
         <w:rPr>
           <w:rFonts w:ascii="Arial" w:cs="Arial" w:eastAsia="Arial" w:hAnsi="Arial"/>
         </w:rPr>
-        <w:t xml:space="preserve"> Whether to add material from the 180, 182, 386 and Analysis texts, “the book”, Loulwah’s notes and the other contributions listed in Section 3.2 to this edition or to a later one.</w:t>
-      </w:r>
-    </w:p>
-    <w:p>
-      <w:pPr>
-        <w:pStyle w:val="ListParagraph"/>
-        <w:numPr>
-          <w:ilvl w:val="0"/>
-          <w:numId w:val="7"/>
-        </w:numPr>
-        <w:spacing w:after="80" w:line="290"/>
-      </w:pPr>
-      <w:r>
-        <w:rPr>
-          <w:rFonts w:ascii="Arial" w:cs="Arial" w:eastAsia="Arial" w:hAnsi="Arial"/>
-          <w:b/>
-          <w:bCs/>
-        </w:rPr>
-        <w:t xml:space="preserve">Fairclough.</w:t>
-      </w:r>
-      <w:r>
-        <w:rPr>
-          <w:rFonts w:ascii="Arial" w:cs="Arial" w:eastAsia="Arial" w:hAnsi="Arial"/>
-        </w:rPr>
-        <w:t xml:space="preserve"> Whether the three practical questions in Chapter 19 and Checklist 3 are enough for what the professor intends by the relational model.</w:t>
+        <w:t xml:space="preserve"> Whether the three practical questions in Chapter 19 are enough for what the professor intends by the relational model.</w:t>
       </w:r>
     </w:p>
     <w:p>

</xml_diff>

<commit_message>
Make the grammar, technology and audiovisual chapters practical
Add beginner material on the three kinds of translation, the verbs be,
do and have, word-level problems, fixed expressions and idioms, news
headlines, and technical and literary texts. Give Chapter 22 the tools
translators use, a post-editing example and localisation, and give
Chapters 26 and 27 first steps, a subtitling method, a worked example
and rules for Arabic subtitles. Update the editorial report.

Co-Authored-By: Claude Opus 5.5 <noreply@anthropic.com>
Claude-Session: https://claude.ai/code/session_01VkNWz9zCVkDAANuF8jpQYy
</commit_message>
<xml_diff>
--- a/Handbook-Editorial-Report.docx
+++ b/Handbook-Editorial-Report.docx
@@ -248,7 +248,7 @@
         <w:rPr>
           <w:rFonts w:ascii="Arial" w:cs="Arial" w:eastAsia="Arial" w:hAnsi="Arial"/>
         </w:rPr>
-        <w:t xml:space="preserve">86 pages including the covers, B5 page size (176 × 250 mm), with 9 parts and 27 chapters, followed by a glossary of 103 terms, a list of 38 references and a page with the QR code of the team’s website.</w:t>
+        <w:t xml:space="preserve">92 pages including the covers, B5 page size (176 × 250 mm), with 9 parts and 27 chapters, followed by a glossary of 110 terms, a list of 38 references and a page with the QR code of the team’s website.</w:t>
       </w:r>
     </w:p>
     <w:p>
@@ -2443,7 +2443,7 @@
                 <w:sz w:val="19"/>
                 <w:szCs w:val="19"/>
               </w:rPr>
-              <w:t xml:space="preserve">Every chapter opens with a list of key terms, each with its Arabic equivalent and a short definition. The glossary is compiled from these lists and has 103 terms, each with the chapter where it is explained.</w:t>
+              <w:t xml:space="preserve">Every chapter opens with a list of key terms, each with its Arabic equivalent and a short definition. The glossary is compiled from these lists and has 110 terms, each with the chapter where it is explained.</w:t>
             </w:r>
           </w:p>
         </w:tc>
@@ -10005,7 +10005,7 @@
         <w:rPr>
           <w:rFonts w:ascii="Arial" w:cs="Arial" w:eastAsia="Arial" w:hAnsi="Arial"/>
         </w:rPr>
-        <w:t xml:space="preserve">At the team’s request, the handbook was shortened from 102 to 86 pages by removing material that a beginner does not need in order to use the book:</w:t>
+        <w:t xml:space="preserve">At the team’s request, the handbook was shortened from 102 to 86 pages (92 after the final additions in Section 9) by removing material that a beginner does not need in order to use the book:</w:t>
       </w:r>
     </w:p>
     <w:p>
@@ -11266,6 +11266,191 @@
     <w:p>
       <w:pPr>
         <w:spacing w:after="160"/>
+      </w:pPr>
+    </w:p>
+    <w:p>
+      <w:pPr>
+        <w:pStyle w:val="Heading2"/>
+      </w:pPr>
+      <w:r>
+        <w:t xml:space="preserve">9.1 Final additions</w:t>
+      </w:r>
+    </w:p>
+    <w:p>
+      <w:pPr>
+        <w:spacing w:after="140" w:line="300"/>
+        <w:jc w:val="both"/>
+      </w:pPr>
+      <w:r>
+        <w:rPr>
+          <w:rFonts w:ascii="Arial" w:cs="Arial" w:eastAsia="Arial" w:hAnsi="Arial"/>
+        </w:rPr>
+        <w:t xml:space="preserve">In the final revision, the chapters on grammar, meaning, word groups, text types, technology and audiovisual translation were made more practical, using general principles of translation taught at university level. The ideas come from published works already cited in the handbook, mainly Baker (2018) and Jakobson (1959), and every example was written or checked for the handbook:</w:t>
+      </w:r>
+    </w:p>
+    <w:p>
+      <w:pPr>
+        <w:pStyle w:val="ListParagraph"/>
+        <w:numPr>
+          <w:ilvl w:val="0"/>
+          <w:numId w:val="2"/>
+        </w:numPr>
+        <w:spacing w:after="80" w:line="290"/>
+      </w:pPr>
+      <w:r>
+        <w:rPr>
+          <w:rFonts w:ascii="Arial" w:cs="Arial" w:eastAsia="Arial" w:hAnsi="Arial"/>
+        </w:rPr>
+        <w:t xml:space="preserve">Chapter 1: the three kinds of translation, the translator as a reader before a writer, and four common myths about translation.</w:t>
+      </w:r>
+    </w:p>
+    <w:p>
+      <w:pPr>
+        <w:pStyle w:val="ListParagraph"/>
+        <w:numPr>
+          <w:ilvl w:val="0"/>
+          <w:numId w:val="2"/>
+        </w:numPr>
+        <w:spacing w:after="80" w:line="290"/>
+      </w:pPr>
+      <w:r>
+        <w:rPr>
+          <w:rFonts w:ascii="Arial" w:cs="Arial" w:eastAsia="Arial" w:hAnsi="Arial"/>
+        </w:rPr>
+        <w:t xml:space="preserve">Chapter 3: how to translate the English verbs _be_, _do_ and _have_, the Arabic dual, and how to find the gender of _I_ and _you_ from clues in the text.</w:t>
+      </w:r>
+    </w:p>
+    <w:p>
+      <w:pPr>
+        <w:pStyle w:val="ListParagraph"/>
+        <w:numPr>
+          <w:ilvl w:val="0"/>
+          <w:numId w:val="2"/>
+        </w:numPr>
+        <w:spacing w:after="80" w:line="290"/>
+      </w:pPr>
+      <w:r>
+        <w:rPr>
+          <w:rFonts w:ascii="Arial" w:cs="Arial" w:eastAsia="Arial" w:hAnsi="Arial"/>
+        </w:rPr>
+        <w:t xml:space="preserve">Chapter 5: problems with single words: lexical gaps, false equivalents, rare words and words with several meanings.</w:t>
+      </w:r>
+    </w:p>
+    <w:p>
+      <w:pPr>
+        <w:pStyle w:val="ListParagraph"/>
+        <w:numPr>
+          <w:ilvl w:val="0"/>
+          <w:numId w:val="2"/>
+        </w:numPr>
+        <w:spacing w:after="80" w:line="290"/>
+      </w:pPr>
+      <w:r>
+        <w:rPr>
+          <w:rFonts w:ascii="Arial" w:cs="Arial" w:eastAsia="Arial" w:hAnsi="Arial"/>
+        </w:rPr>
+        <w:t xml:space="preserve">Chapter 7: one English verb with several Arabic equivalents (_deliver_).</w:t>
+      </w:r>
+    </w:p>
+    <w:p>
+      <w:pPr>
+        <w:pStyle w:val="ListParagraph"/>
+        <w:numPr>
+          <w:ilvl w:val="0"/>
+          <w:numId w:val="2"/>
+        </w:numPr>
+        <w:spacing w:after="80" w:line="290"/>
+      </w:pPr>
+      <w:r>
+        <w:rPr>
+          <w:rFonts w:ascii="Arial" w:cs="Arial" w:eastAsia="Arial" w:hAnsi="Arial"/>
+        </w:rPr>
+        <w:t xml:space="preserve">Chapter 8: fixed expressions, how to spot an idiom, and five ways to translate one.</w:t>
+      </w:r>
+    </w:p>
+    <w:p>
+      <w:pPr>
+        <w:pStyle w:val="ListParagraph"/>
+        <w:numPr>
+          <w:ilvl w:val="0"/>
+          <w:numId w:val="2"/>
+        </w:numPr>
+        <w:spacing w:after="80" w:line="290"/>
+      </w:pPr>
+      <w:r>
+        <w:rPr>
+          <w:rFonts w:ascii="Arial" w:cs="Arial" w:eastAsia="Arial" w:hAnsi="Arial"/>
+        </w:rPr>
+        <w:t xml:space="preserve">Chapter 13: substitution for times and measures, and Arabic loan words in English.</w:t>
+      </w:r>
+    </w:p>
+    <w:p>
+      <w:pPr>
+        <w:pStyle w:val="ListParagraph"/>
+        <w:numPr>
+          <w:ilvl w:val="0"/>
+          <w:numId w:val="2"/>
+        </w:numPr>
+        <w:spacing w:after="80" w:line="290"/>
+      </w:pPr>
+      <w:r>
+        <w:rPr>
+          <w:rFonts w:ascii="Arial" w:cs="Arial" w:eastAsia="Arial" w:hAnsi="Arial"/>
+        </w:rPr>
+        <w:t xml:space="preserve">Chapter 18: translating news headlines, the structure of news stories, and technical and literary texts.</w:t>
+      </w:r>
+    </w:p>
+    <w:p>
+      <w:pPr>
+        <w:pStyle w:val="ListParagraph"/>
+        <w:numPr>
+          <w:ilvl w:val="0"/>
+          <w:numId w:val="2"/>
+        </w:numPr>
+        <w:spacing w:after="80" w:line="290"/>
+      </w:pPr>
+      <w:r>
+        <w:rPr>
+          <w:rFonts w:ascii="Arial" w:cs="Arial" w:eastAsia="Arial" w:hAnsi="Arial"/>
+        </w:rPr>
+        <w:t xml:space="preserve">Chapter 22: the tools translators use (translation memory, termbases and CAT tools), a worked post-editing example, advice on using AI tools, and localisation.</w:t>
+      </w:r>
+    </w:p>
+    <w:p>
+      <w:pPr>
+        <w:pStyle w:val="ListParagraph"/>
+        <w:numPr>
+          <w:ilvl w:val="0"/>
+          <w:numId w:val="2"/>
+        </w:numPr>
+        <w:spacing w:after="80" w:line="290"/>
+      </w:pPr>
+      <w:r>
+        <w:rPr>
+          <w:rFonts w:ascii="Arial" w:cs="Arial" w:eastAsia="Arial" w:hAnsi="Arial"/>
+        </w:rPr>
+        <w:t xml:space="preserve">Chapter 26: a short list of the main types of audiovisual translation, a real dubbing example, and first steps for beginners, in place of the section on audiovisual translation in the Arab world.</w:t>
+      </w:r>
+    </w:p>
+    <w:p>
+      <w:pPr>
+        <w:pStyle w:val="ListParagraph"/>
+        <w:numPr>
+          <w:ilvl w:val="0"/>
+          <w:numId w:val="2"/>
+        </w:numPr>
+        <w:spacing w:after="80" w:line="290"/>
+      </w:pPr>
+      <w:r>
+        <w:rPr>
+          <w:rFonts w:ascii="Arial" w:cs="Arial" w:eastAsia="Arial" w:hAnsi="Arial"/>
+        </w:rPr>
+        <w:t xml:space="preserve">Chapter 27: a step-by-step method for subtitling, a worked example of condensing a line, and rules for Arabic subtitles.</w:t>
+      </w:r>
+    </w:p>
+    <w:p>
+      <w:pPr>
+        <w:spacing w:after="60"/>
       </w:pPr>
     </w:p>
     <w:p>

</xml_diff>

<commit_message>
Use the course examples for existing concepts instead of repeating them
Remove the myths box and the duplicate substitution, localisation and
several-meanings entries, which repeated concepts already in the book,
and add examples to the existing concepts instead: idioms, arabicisation,
medical terms and a word with several meanings. Update the report.

Co-Authored-By: Claude Opus 5.5 <noreply@anthropic.com>
Claude-Session: https://claude.ai/code/session_01VkNWz9zCVkDAANuF8jpQYy
</commit_message>
<xml_diff>
--- a/Handbook-Editorial-Report.docx
+++ b/Handbook-Editorial-Report.docx
@@ -248,7 +248,7 @@
         <w:rPr>
           <w:rFonts w:ascii="Arial" w:cs="Arial" w:eastAsia="Arial" w:hAnsi="Arial"/>
         </w:rPr>
-        <w:t xml:space="preserve">92 pages including the covers, B5 page size (176 × 250 mm), with 9 parts and 27 chapters, followed by a glossary of 110 terms, a list of 38 references and a page with the QR code of the team’s website.</w:t>
+        <w:t xml:space="preserve">92 pages including the covers, B5 page size (176 × 250 mm), with 9 parts and 27 chapters, followed by a glossary of 109 terms, a list of 38 references and a page with the QR code of the team’s website.</w:t>
       </w:r>
     </w:p>
     <w:p>
@@ -2443,7 +2443,7 @@
                 <w:sz w:val="19"/>
                 <w:szCs w:val="19"/>
               </w:rPr>
-              <w:t xml:space="preserve">Every chapter opens with a list of key terms, each with its Arabic equivalent and a short definition. The glossary is compiled from these lists and has 110 terms, each with the chapter where it is explained.</w:t>
+              <w:t xml:space="preserve">Every chapter opens with a list of key terms, each with its Arabic equivalent and a short definition. The glossary is compiled from these lists and has 109 terms, each with the chapter where it is explained.</w:t>
             </w:r>
           </w:p>
         </w:tc>
@@ -11285,7 +11285,7 @@
         <w:rPr>
           <w:rFonts w:ascii="Arial" w:cs="Arial" w:eastAsia="Arial" w:hAnsi="Arial"/>
         </w:rPr>
-        <w:t xml:space="preserve">In the final revision, the chapters on grammar, meaning, word groups, text types, technology and audiovisual translation were made more practical, using general principles of translation taught at university level. The ideas come from published works already cited in the handbook, mainly Baker (2018) and Jakobson (1959), and every example was written or checked for the handbook:</w:t>
+        <w:t xml:space="preserve">In the final revision, the chapters on grammar, meaning, word groups, text types, technology and audiovisual translation were made more practical, using general principles of translation taught at university level. Where a concept was already in the handbook, only examples were added; new concepts were added only where the handbook had a gap. The ideas come from published works already cited in the handbook, mainly Baker (2018) and Jakobson (1959), and every example was checked for the handbook:</w:t>
       </w:r>
     </w:p>
     <w:p>
@@ -11301,7 +11301,7 @@
         <w:rPr>
           <w:rFonts w:ascii="Arial" w:cs="Arial" w:eastAsia="Arial" w:hAnsi="Arial"/>
         </w:rPr>
-        <w:t xml:space="preserve">Chapter 1: the three kinds of translation, the translator as a reader before a writer, and four common myths about translation.</w:t>
+        <w:t xml:space="preserve">Chapter 1: the three kinds of translation, and the translator as a reader before a writer.</w:t>
       </w:r>
     </w:p>
     <w:p>
@@ -11333,7 +11333,7 @@
         <w:rPr>
           <w:rFonts w:ascii="Arial" w:cs="Arial" w:eastAsia="Arial" w:hAnsi="Arial"/>
         </w:rPr>
-        <w:t xml:space="preserve">Chapter 5: problems with single words: lexical gaps, false equivalents, rare words and words with several meanings.</w:t>
+        <w:t xml:space="preserve">Chapter 5: problems with single words: lexical gaps, false equivalents and rare words.</w:t>
       </w:r>
     </w:p>
     <w:p>
@@ -11349,7 +11349,21 @@
         <w:rPr>
           <w:rFonts w:ascii="Arial" w:cs="Arial" w:eastAsia="Arial" w:hAnsi="Arial"/>
         </w:rPr>
-        <w:t xml:space="preserve">Chapter 7: one English verb with several Arabic equivalents (_deliver_).</w:t>
+        <w:t xml:space="preserve">Chapter 6: one more example of a word with several meanings (</w:t>
+      </w:r>
+      <w:r>
+        <w:rPr>
+          <w:rFonts w:ascii="Arial" w:cs="Arial" w:hAnsi="Arial"/>
+          <w:szCs w:val="23"/>
+          <w:rtl/>
+        </w:rPr>
+        <w:t xml:space="preserve">خط</w:t>
+      </w:r>
+      <w:r>
+        <w:rPr>
+          <w:rFonts w:ascii="Arial" w:cs="Arial" w:eastAsia="Arial" w:hAnsi="Arial"/>
+        </w:rPr>
+        <w:t xml:space="preserve">).</w:t>
       </w:r>
     </w:p>
     <w:p>
@@ -11365,7 +11379,7 @@
         <w:rPr>
           <w:rFonts w:ascii="Arial" w:cs="Arial" w:eastAsia="Arial" w:hAnsi="Arial"/>
         </w:rPr>
-        <w:t xml:space="preserve">Chapter 8: fixed expressions, how to spot an idiom, and five ways to translate one.</w:t>
+        <w:t xml:space="preserve">Chapter 7: one English verb with several Arabic equivalents (_deliver_).</w:t>
       </w:r>
     </w:p>
     <w:p>
@@ -11381,7 +11395,7 @@
         <w:rPr>
           <w:rFonts w:ascii="Arial" w:cs="Arial" w:eastAsia="Arial" w:hAnsi="Arial"/>
         </w:rPr>
-        <w:t xml:space="preserve">Chapter 13: substitution for times and measures, and Arabic loan words in English.</w:t>
+        <w:t xml:space="preserve">Chapter 8: fixed expressions, how to spot an idiom, five ways to translate one, and three more idiom examples.</w:t>
       </w:r>
     </w:p>
     <w:p>
@@ -11397,7 +11411,7 @@
         <w:rPr>
           <w:rFonts w:ascii="Arial" w:cs="Arial" w:eastAsia="Arial" w:hAnsi="Arial"/>
         </w:rPr>
-        <w:t xml:space="preserve">Chapter 18: translating news headlines, the structure of news stories, and technical and literary texts.</w:t>
+        <w:t xml:space="preserve">Chapter 13: examples of cultural substitution for times and measures, and of Arabic loan words in English.</w:t>
       </w:r>
     </w:p>
     <w:p>
@@ -11413,7 +11427,55 @@
         <w:rPr>
           <w:rFonts w:ascii="Arial" w:cs="Arial" w:eastAsia="Arial" w:hAnsi="Arial"/>
         </w:rPr>
-        <w:t xml:space="preserve">Chapter 22: the tools translators use (translation memory, termbases and CAT tools), a worked post-editing example, advice on using AI tools, and localisation.</w:t>
+        <w:t xml:space="preserve">Chapter 16: more examples of arabicisation.</w:t>
+      </w:r>
+    </w:p>
+    <w:p>
+      <w:pPr>
+        <w:pStyle w:val="ListParagraph"/>
+        <w:numPr>
+          <w:ilvl w:val="0"/>
+          <w:numId w:val="2"/>
+        </w:numPr>
+        <w:spacing w:after="80" w:line="290"/>
+      </w:pPr>
+      <w:r>
+        <w:rPr>
+          <w:rFonts w:ascii="Arial" w:cs="Arial" w:eastAsia="Arial" w:hAnsi="Arial"/>
+        </w:rPr>
+        <w:t xml:space="preserve">Chapter 18: translating news headlines, the structure of news stories, and technical and literary texts.</w:t>
+      </w:r>
+    </w:p>
+    <w:p>
+      <w:pPr>
+        <w:pStyle w:val="ListParagraph"/>
+        <w:numPr>
+          <w:ilvl w:val="0"/>
+          <w:numId w:val="2"/>
+        </w:numPr>
+        <w:spacing w:after="80" w:line="290"/>
+      </w:pPr>
+      <w:r>
+        <w:rPr>
+          <w:rFonts w:ascii="Arial" w:cs="Arial" w:eastAsia="Arial" w:hAnsi="Arial"/>
+        </w:rPr>
+        <w:t xml:space="preserve">Chapter 21: medical examples of specialised terms.</w:t>
+      </w:r>
+    </w:p>
+    <w:p>
+      <w:pPr>
+        <w:pStyle w:val="ListParagraph"/>
+        <w:numPr>
+          <w:ilvl w:val="0"/>
+          <w:numId w:val="2"/>
+        </w:numPr>
+        <w:spacing w:after="80" w:line="290"/>
+      </w:pPr>
+      <w:r>
+        <w:rPr>
+          <w:rFonts w:ascii="Arial" w:cs="Arial" w:eastAsia="Arial" w:hAnsi="Arial"/>
+        </w:rPr>
+        <w:t xml:space="preserve">Chapter 22: the tools translators use (translation memory, termbases and CAT tools), a worked post-editing example, advice on using AI tools, and a practical note on localisation.</w:t>
       </w:r>
     </w:p>
     <w:p>

</xml_diff>

<commit_message>
Rewrite the whole handbook as a step-by-step guide and finalise it
Rewrite Chapters 3 to 27 in the guided format of Chapters 1 and 2: each
chapter opens with "Where we are", follows numbered steps that show a
problem before its solution, and ends with Remember and Words to
remember. Add a short further-reading list.

Apply 104 corrections from a second full expert review and a check of
every reference and quotation: among them the example for "have", a
wrong cross-reference, conflicting advice on explanatory translation,
the definition of spotting, Newmark p. 11, and missing DOIs and page
ranges. Update the editorial report and the correction log.

Co-Authored-By: Claude Opus 5.5 <noreply@anthropic.com>
Claude-Session: https://claude.ai/code/session_01VkNWz9zCVkDAANuF8jpQYy
</commit_message>
<xml_diff>
--- a/Handbook-Editorial-Report.docx
+++ b/Handbook-Editorial-Report.docx
@@ -248,7 +248,7 @@
         <w:rPr>
           <w:rFonts w:ascii="Arial" w:cs="Arial" w:eastAsia="Arial" w:hAnsi="Arial"/>
         </w:rPr>
-        <w:t xml:space="preserve">92 pages including the covers, B5 page size (176 × 250 mm), with 9 parts and 27 chapters, followed by a glossary of 109 terms, a list of 38 references and a page with the QR code of the team’s website.</w:t>
+        <w:t xml:space="preserve">96 pages including the covers, B5 page size (176 × 250 mm), with 9 parts and 27 chapters, followed by a list of abbreviations, a short list of further reading, a glossary of 110 terms, a list of 38 references and a page with the QR code of the team’s website.</w:t>
       </w:r>
     </w:p>
     <w:p>
@@ -2443,7 +2443,7 @@
                 <w:sz w:val="19"/>
                 <w:szCs w:val="19"/>
               </w:rPr>
-              <w:t xml:space="preserve">Every chapter opens with a list of key terms, each with its Arabic equivalent and a short definition. The glossary is compiled from these lists and has 109 terms, each with the chapter where it is explained.</w:t>
+              <w:t xml:space="preserve">Every chapter opens with a list of key terms, each with its Arabic equivalent and a short definition. The glossary is compiled from these lists and has 110 terms, each with the chapter where it is explained.</w:t>
             </w:r>
           </w:p>
         </w:tc>
@@ -5790,7 +5790,7 @@
                 <w:sz w:val="19"/>
                 <w:szCs w:val="19"/>
               </w:rPr>
-              <w:t xml:space="preserve">Title page, copyright page, contents, preface, acknowledgements, how to use this handbook, abbreviations.</w:t>
+              <w:t xml:space="preserve">Title page, copyright page, contents, preface and acknowledgements, and “Start here”, which explains to a complete beginner what a translator does, the four steps of every translation and the journey through the book.</w:t>
             </w:r>
           </w:p>
         </w:tc>
@@ -6816,13 +6816,13 @@
           <w:b/>
           <w:bCs/>
         </w:rPr>
-        <w:t xml:space="preserve">Introduction:</w:t>
-      </w:r>
-      <w:r>
-        <w:rPr>
-          <w:rFonts w:ascii="Arial" w:cs="Arial" w:eastAsia="Arial" w:hAnsi="Arial"/>
-        </w:rPr>
-        <w:t xml:space="preserve"> what the chapter is about and how it follows from the previous one.</w:t>
+        <w:t xml:space="preserve">Where we are:</w:t>
+      </w:r>
+      <w:r>
+        <w:rPr>
+          <w:rFonts w:ascii="Arial" w:cs="Arial" w:eastAsia="Arial" w:hAnsi="Arial"/>
+        </w:rPr>
+        <w:t xml:space="preserve"> what the reader already knows, what the chapter will show and what they will be able to do by the end.</w:t>
       </w:r>
     </w:p>
     <w:p>
@@ -6840,13 +6840,13 @@
           <w:b/>
           <w:bCs/>
         </w:rPr>
-        <w:t xml:space="preserve">Key terms:</w:t>
-      </w:r>
-      <w:r>
-        <w:rPr>
-          <w:rFonts w:ascii="Arial" w:cs="Arial" w:eastAsia="Arial" w:hAnsi="Arial"/>
-        </w:rPr>
-        <w:t xml:space="preserve"> each term with its Arabic equivalent and a one-line definition.</w:t>
+        <w:t xml:space="preserve">Numbered steps</w:t>
+      </w:r>
+      <w:r>
+        <w:rPr>
+          <w:rFonts w:ascii="Arial" w:cs="Arial" w:eastAsia="Arial" w:hAnsi="Arial"/>
+        </w:rPr>
+        <w:t xml:space="preserve"> (Step 1, Step 2 …): each step shows a problem with an example first, then the solution, and gives the technical name only after the idea has been explained.</w:t>
       </w:r>
     </w:p>
     <w:p>
@@ -6864,13 +6864,13 @@
           <w:b/>
           <w:bCs/>
         </w:rPr>
-        <w:t xml:space="preserve">Explanation and examples:</w:t>
-      </w:r>
-      <w:r>
-        <w:rPr>
-          <w:rFonts w:ascii="Arial" w:cs="Arial" w:eastAsia="Arial" w:hAnsi="Arial"/>
-        </w:rPr>
-        <w:t xml:space="preserve"> short sections, with examples in both languages.</w:t>
+        <w:t xml:space="preserve">Common mistakes</w:t>
+      </w:r>
+      <w:r>
+        <w:rPr>
+          <w:rFonts w:ascii="Arial" w:cs="Arial" w:eastAsia="Arial" w:hAnsi="Arial"/>
+        </w:rPr>
+        <w:t xml:space="preserve">, in chapters where beginners often make the same errors.</w:t>
       </w:r>
     </w:p>
     <w:p>
@@ -6912,13 +6912,13 @@
           <w:b/>
           <w:bCs/>
         </w:rPr>
-        <w:t xml:space="preserve">Remember:</w:t>
-      </w:r>
-      <w:r>
-        <w:rPr>
-          <w:rFonts w:ascii="Arial" w:cs="Arial" w:eastAsia="Arial" w:hAnsi="Arial"/>
-        </w:rPr>
-        <w:t xml:space="preserve"> the main points of the chapter in a short list.</w:t>
+        <w:t xml:space="preserve">Remember and Words to remember:</w:t>
+      </w:r>
+      <w:r>
+        <w:rPr>
+          <w:rFonts w:ascii="Arial" w:cs="Arial" w:eastAsia="Arial" w:hAnsi="Arial"/>
+        </w:rPr>
+        <w:t xml:space="preserve"> the main points, and the chapter’s key terms with their Arabic equivalents and short definitions, in one box at the end.</w:t>
       </w:r>
     </w:p>
     <w:p>
@@ -10085,7 +10085,7 @@
         <w:rPr>
           <w:rFonts w:ascii="Arial" w:cs="Arial" w:eastAsia="Arial" w:hAnsi="Arial"/>
         </w:rPr>
-        <w:t xml:space="preserve">The separate page for the acknowledgements, which now closes the preface, and the separate page for the abbreviations, which now follow “How to use this handbook”.</w:t>
+        <w:t xml:space="preserve">The separate page for the acknowledgements, which now closes the preface, and the separate page for the abbreviations, which moved to the back of the book.</w:t>
       </w:r>
     </w:p>
     <w:p>
@@ -10114,7 +10114,140 @@
         <w:pStyle w:val="Heading2"/>
       </w:pPr>
       <w:r>
-        <w:t xml:space="preserve">8.6 Removed before publication</w:t>
+        <w:t xml:space="preserve">8.6 Guided rewrite and final review</w:t>
+      </w:r>
+    </w:p>
+    <w:p>
+      <w:pPr>
+        <w:spacing w:after="140" w:line="300"/>
+        <w:jc w:val="both"/>
+      </w:pPr>
+      <w:r>
+        <w:rPr>
+          <w:rFonts w:ascii="Arial" w:cs="Arial" w:eastAsia="Arial" w:hAnsi="Arial"/>
+        </w:rPr>
+        <w:t xml:space="preserve">At the team’s request, the whole book was rewritten as a step-by-step guide for readers who have never studied translation. The format follows the common pattern of widely used translation coursebooks, such as Baker (2018), Dickins et al. (2016) and Ghazala (2008): explain the idea, show the problem with an example, show the solution, then practise and summarise; and move from basic ideas to words, grammar, whole texts and specialised fields.</w:t>
+      </w:r>
+    </w:p>
+    <w:p>
+      <w:pPr>
+        <w:pStyle w:val="ListParagraph"/>
+        <w:numPr>
+          <w:ilvl w:val="0"/>
+          <w:numId w:val="2"/>
+        </w:numPr>
+        <w:spacing w:after="80" w:line="290"/>
+      </w:pPr>
+      <w:r>
+        <w:rPr>
+          <w:rFonts w:ascii="Arial" w:cs="Arial" w:eastAsia="Arial" w:hAnsi="Arial"/>
+        </w:rPr>
+        <w:t xml:space="preserve">A new opening, “Start here”, explains what a translator does with an everyday example, the four steps of every translation and the journey through the book.</w:t>
+      </w:r>
+    </w:p>
+    <w:p>
+      <w:pPr>
+        <w:pStyle w:val="ListParagraph"/>
+        <w:numPr>
+          <w:ilvl w:val="0"/>
+          <w:numId w:val="2"/>
+        </w:numPr>
+        <w:spacing w:after="80" w:line="290"/>
+      </w:pPr>
+      <w:r>
+        <w:rPr>
+          <w:rFonts w:ascii="Arial" w:cs="Arial" w:eastAsia="Arial" w:hAnsi="Arial"/>
+        </w:rPr>
+        <w:t xml:space="preserve">Each chapter now opens with “Where we are”, follows numbered steps, and ends with “Remember” and “Words to remember”. The key terms moved from the start to the end of each chapter, so that ideas are explained before they are named.</w:t>
+      </w:r>
+    </w:p>
+    <w:p>
+      <w:pPr>
+        <w:pStyle w:val="ListParagraph"/>
+        <w:numPr>
+          <w:ilvl w:val="0"/>
+          <w:numId w:val="2"/>
+        </w:numPr>
+        <w:spacing w:after="80" w:line="290"/>
+      </w:pPr>
+      <w:r>
+        <w:rPr>
+          <w:rFonts w:ascii="Arial" w:cs="Arial" w:eastAsia="Arial" w:hAnsi="Arial"/>
+        </w:rPr>
+        <w:t xml:space="preserve">The abbreviations moved to the back of the book, and a short list of further reading was added, using only books already in the references.</w:t>
+      </w:r>
+    </w:p>
+    <w:p>
+      <w:pPr>
+        <w:pStyle w:val="ListParagraph"/>
+        <w:numPr>
+          <w:ilvl w:val="0"/>
+          <w:numId w:val="2"/>
+        </w:numPr>
+        <w:spacing w:after="80" w:line="290"/>
+      </w:pPr>
+      <w:r>
+        <w:rPr>
+          <w:rFonts w:ascii="Arial" w:cs="Arial" w:eastAsia="Arial" w:hAnsi="Arial"/>
+        </w:rPr>
+        <w:t xml:space="preserve">All examples, Arabic strings and citations were kept; this was checked automatically after the rewrite.</w:t>
+      </w:r>
+    </w:p>
+    <w:p>
+      <w:pPr>
+        <w:pStyle w:val="ListParagraph"/>
+        <w:numPr>
+          <w:ilvl w:val="0"/>
+          <w:numId w:val="2"/>
+        </w:numPr>
+        <w:spacing w:after="80" w:line="290"/>
+      </w:pPr>
+      <w:r>
+        <w:rPr>
+          <w:rFonts w:ascii="Arial" w:cs="Arial" w:eastAsia="Arial" w:hAnsi="Arial"/>
+        </w:rPr>
+        <w:t xml:space="preserve">A second full expert review followed, in both languages, with a check of every reference and quotation against published information. It led to 102 further corrections, listed in the Correction Log. Among them: the example for the verb _have_, a wrong cross-reference in Chapter 6, conflicting advice on when to use explanatory translation, the presentation of </w:t>
+      </w:r>
+      <w:r>
+        <w:rPr>
+          <w:rFonts w:ascii="Arial" w:cs="Arial" w:hAnsi="Arial"/>
+          <w:szCs w:val="23"/>
+          <w:rtl/>
+        </w:rPr>
+        <w:t xml:space="preserve">انتحاري</w:t>
+      </w:r>
+      <w:r>
+        <w:rPr>
+          <w:rFonts w:ascii="Arial" w:cs="Arial" w:eastAsia="Arial" w:hAnsi="Arial"/>
+        </w:rPr>
+        <w:t xml:space="preserve"> and </w:t>
+      </w:r>
+      <w:r>
+        <w:rPr>
+          <w:rFonts w:ascii="Arial" w:cs="Arial" w:hAnsi="Arial"/>
+          <w:szCs w:val="23"/>
+          <w:rtl/>
+        </w:rPr>
+        <w:t xml:space="preserve">استشهادي</w:t>
+      </w:r>
+      <w:r>
+        <w:rPr>
+          <w:rFonts w:ascii="Arial" w:cs="Arial" w:eastAsia="Arial" w:hAnsi="Arial"/>
+        </w:rPr>
+        <w:t xml:space="preserve"> in Chapter 19, the definition of spotting in subtitling, the page number of a quotation from Newmark (1988, p. 11), and missing details in several references.</w:t>
+      </w:r>
+    </w:p>
+    <w:p>
+      <w:pPr>
+        <w:spacing w:after="60"/>
+      </w:pPr>
+    </w:p>
+    <w:p>
+      <w:pPr>
+        <w:pStyle w:val="Heading2"/>
+      </w:pPr>
+      <w:r>
+        <w:t xml:space="preserve">8.7 Removed before publication</w:t>
       </w:r>
     </w:p>
     <w:p>
@@ -10342,7 +10475,7 @@
                 <w:sz w:val="19"/>
                 <w:szCs w:val="19"/>
               </w:rPr>
-              <w:t xml:space="preserve">Front matter: copyright page, preface, acknowledgements, how to use the handbook, abbreviations</w:t>
+              <w:t xml:space="preserve">Front matter: copyright page, preface, acknowledgements and “Start here”</w:t>
             </w:r>
           </w:p>
         </w:tc>

</xml_diff>

<commit_message>
Add team-documents audit appendix and extend final report
- Final report: new Section 5 on what was used, edited and not used from
  the team's Teams documents (Draft, professor's notes, Terminology, AVT),
  with reference status and new items to verify
- New appendix: Handbook-Source-Documents-Audit.docx, point-by-point audit
- Editorial report: count and chapter corrections
- Handbook: Ch2 cross-reference to Ch26; Ch21 citation scope for
  Damascus and Rabat; both editions rebuilt

Co-Authored-By: Claude Opus 5.5 <noreply@anthropic.com>
Claude-Session: https://claude.ai/code/session_01VkNWz9zCVkDAANuF8jpQYy
</commit_message>
<xml_diff>
--- a/Handbook-Editorial-Report.docx
+++ b/Handbook-Editorial-Report.docx
@@ -1258,7 +1258,7 @@
         <w:rPr>
           <w:rFonts w:ascii="Arial" w:cs="Arial" w:eastAsia="Arial" w:hAnsi="Arial"/>
         </w:rPr>
-        <w:t xml:space="preserve">Practice texts from Masooma and examples from Shaikha (paragraphs 51, 52 and 55).</w:t>
+        <w:t xml:space="preserve">Practice texts from Masooma (paragraph 55). Shaikha’s study notes were received later and used, as listed in the Final Report, Section 4.1.</w:t>
       </w:r>
     </w:p>
     <w:p>
@@ -3163,7 +3163,7 @@
                 <w:sz w:val="19"/>
                 <w:szCs w:val="19"/>
               </w:rPr>
-              <w:t xml:space="preserve">Chapters 11, 14 and 18</w:t>
+              <w:t xml:space="preserve">Chapters 14 and 18</w:t>
             </w:r>
           </w:p>
         </w:tc>
@@ -3193,7 +3193,7 @@
                 <w:sz w:val="19"/>
                 <w:szCs w:val="19"/>
               </w:rPr>
-              <w:t xml:space="preserve">Examples from al-Mutanabbi and Shakespeare’s Sonnet 18, and poetic metaphors.</w:t>
+              <w:t xml:space="preserve">Examples from al-Mutanabbi and Shakespeare’s Sonnet 18.</w:t>
             </w:r>
           </w:p>
         </w:tc>
@@ -9985,7 +9985,7 @@
         <w:rPr>
           <w:rFonts w:ascii="Arial" w:cs="Arial" w:eastAsia="Arial" w:hAnsi="Arial"/>
         </w:rPr>
-        <w:t xml:space="preserve">An error found on the first page of Chapter 1 (a freelancer given as an example of a commissioned translator) led to a full expert review of the book in both languages. The review checked concepts and facts, Arabic language and terminology, examples, consistency, repetition, English, neutrality and citations. 192 corrections were made, 23 of them of high importance. Examples of the most important corrections: the rule on Arabic word order (both verb-first and subject-first sentences are correct), the Arabic equivalent of “is”, the explanations of zakat and tayammum, the Arabic terms for lexical creation, lexicalisation, form and modulation, the definition of a terminologist, and several examples that did not illustrate the point they were given for. Every correction and its reason is listed in a separate document, the Correction Log, together with 18 points that must be checked against the printed sources.</w:t>
+        <w:t xml:space="preserve">An error found on the first page of Chapter 1 (a freelancer given as an example of a commissioned translator) led to a full expert review of the book in both languages. The review checked concepts and facts, Arabic language and terminology, examples, consistency, repetition, English, neutrality and citations. 192 corrections were made, 23 of them of high importance. Examples of the most important corrections: the rule on Arabic word order (both verb-first and subject-first sentences are correct), the Arabic equivalent of “is”, the explanations of zakat and tayammum, the Arabic terms for lexical creation, lexicalisation, form and modulation, the definition of a terminologist, and several examples that did not illustrate the point they were given for. Every correction and its reason is listed in a separate document, the Correction Log, together with 30 points that must be checked against the printed sources.</w:t>
       </w:r>
     </w:p>
     <w:p>
@@ -12316,7 +12316,7 @@
                 <w:sz w:val="19"/>
                 <w:szCs w:val="19"/>
               </w:rPr>
-              <w:t xml:space="preserve">Wording confirmed; page not confirmed</w:t>
+              <w:t xml:space="preserve">Confirmed</w:t>
             </w:r>
           </w:p>
         </w:tc>
@@ -12346,7 +12346,7 @@
                 <w:sz w:val="19"/>
                 <w:szCs w:val="19"/>
               </w:rPr>
-              <w:t xml:space="preserve">Cited by chapter (Chapter 2) instead of page.</w:t>
+              <w:t xml:space="preserve">Now cited with its page (Newmark, 1988, p. 11).</w:t>
             </w:r>
           </w:p>
         </w:tc>
@@ -13392,101 +13392,6 @@
                 <w:szCs w:val="19"/>
               </w:rPr>
               <w:t xml:space="preserve">Changed from a quotation to a paraphrase.</w:t>
-            </w:r>
-          </w:p>
-        </w:tc>
-      </w:tr>
-      <w:tr>
-        <w:trPr>
-          <w:cantSplit/>
-        </w:trPr>
-        <w:tc>
-          <w:tcPr>
-            <w:tcW w:type="dxa" w:w="3266"/>
-            <w:tcBorders>
-              <w:top w:val="single" w:color="000000" w:sz="4"/>
-              <w:left w:val="single" w:color="000000" w:sz="4"/>
-              <w:bottom w:val="single" w:color="000000" w:sz="4"/>
-              <w:right w:val="single" w:color="000000" w:sz="4"/>
-            </w:tcBorders>
-            <w:tcMar>
-              <w:top w:type="dxa" w:w="60"/>
-              <w:left w:type="dxa" w:w="100"/>
-              <w:bottom w:type="dxa" w:w="60"/>
-              <w:right w:type="dxa" w:w="100"/>
-            </w:tcMar>
-          </w:tcPr>
-          <w:p>
-            <w:pPr>
-              <w:spacing w:after="0" w:line="260"/>
-            </w:pPr>
-            <w:r>
-              <w:rPr>
-                <w:rFonts w:ascii="Arial" w:cs="Arial" w:eastAsia="Arial" w:hAnsi="Arial"/>
-                <w:sz w:val="19"/>
-                <w:szCs w:val="19"/>
-              </w:rPr>
-              <w:t xml:space="preserve">Nord (1997): “function plus loyalty”</w:t>
-            </w:r>
-          </w:p>
-        </w:tc>
-        <w:tc>
-          <w:tcPr>
-            <w:tcW w:type="dxa" w:w="2540"/>
-            <w:tcBorders>
-              <w:top w:val="single" w:color="000000" w:sz="4"/>
-              <w:left w:val="single" w:color="000000" w:sz="4"/>
-              <w:bottom w:val="single" w:color="000000" w:sz="4"/>
-              <w:right w:val="single" w:color="000000" w:sz="4"/>
-            </w:tcBorders>
-            <w:tcMar>
-              <w:top w:type="dxa" w:w="60"/>
-              <w:left w:type="dxa" w:w="100"/>
-              <w:bottom w:type="dxa" w:w="60"/>
-              <w:right w:type="dxa" w:w="100"/>
-            </w:tcMar>
-          </w:tcPr>
-          <w:p>
-            <w:pPr>
-              <w:spacing w:after="0" w:line="260"/>
-            </w:pPr>
-            <w:r>
-              <w:rPr>
-                <w:rFonts w:ascii="Arial" w:cs="Arial" w:eastAsia="Arial" w:hAnsi="Arial"/>
-                <w:sz w:val="19"/>
-                <w:szCs w:val="19"/>
-              </w:rPr>
-              <w:t xml:space="preserve">Confirmed</w:t>
-            </w:r>
-          </w:p>
-        </w:tc>
-        <w:tc>
-          <w:tcPr>
-            <w:tcW w:type="dxa" w:w="3265"/>
-            <w:tcBorders>
-              <w:top w:val="single" w:color="000000" w:sz="4"/>
-              <w:left w:val="single" w:color="000000" w:sz="4"/>
-              <w:bottom w:val="single" w:color="000000" w:sz="4"/>
-              <w:right w:val="single" w:color="000000" w:sz="4"/>
-            </w:tcBorders>
-            <w:tcMar>
-              <w:top w:type="dxa" w:w="60"/>
-              <w:left w:type="dxa" w:w="100"/>
-              <w:bottom w:type="dxa" w:w="60"/>
-              <w:right w:type="dxa" w:w="100"/>
-            </w:tcMar>
-          </w:tcPr>
-          <w:p>
-            <w:pPr>
-              <w:spacing w:after="0" w:line="260"/>
-            </w:pPr>
-            <w:r>
-              <w:rPr>
-                <w:rFonts w:ascii="Arial" w:cs="Arial" w:eastAsia="Arial" w:hAnsi="Arial"/>
-                <w:sz w:val="19"/>
-                <w:szCs w:val="19"/>
-              </w:rPr>
-              <w:t xml:space="preserve">None needed.</w:t>
             </w:r>
           </w:p>
         </w:tc>
@@ -14219,7 +14124,7 @@
         <w:rPr>
           <w:rFonts w:ascii="Arial" w:cs="Arial" w:eastAsia="Arial" w:hAnsi="Arial"/>
         </w:rPr>
-        <w:t xml:space="preserve">Check the 18 points listed in Section 4 of the Correction Log against the printed sources.</w:t>
+        <w:t xml:space="preserve">Check the 30 points listed in Section 5 of the Correction Log against the printed sources.</w:t>
       </w:r>
     </w:p>
     <w:p>

</xml_diff>

<commit_message>
Cover the Text Analysis Model and the Teams chat requests
- Ch10: communicative translation (Newmark, 1988)
- Ch13: explicitation and implicitation (Vinay & Darbelnet, 1958/1995)
- Ch17: linguistic and external levels, from the team's Text Analysis
  Model; Fairclough (2003) added to the References
- Final report and appendix: new sections on the Text Analysis Model
  and the Teams chat requests; contributor attributions; new items to
  verify; counts updated (98 pages, 113 terms, 39 references)

Co-Authored-By: Claude Opus 5.5 <noreply@anthropic.com>
Claude-Session: https://claude.ai/code/session_01VkNWz9zCVkDAANuF8jpQYy
</commit_message>
<xml_diff>
--- a/Handbook-Editorial-Report.docx
+++ b/Handbook-Editorial-Report.docx
@@ -248,7 +248,7 @@
         <w:rPr>
           <w:rFonts w:ascii="Arial" w:cs="Arial" w:eastAsia="Arial" w:hAnsi="Arial"/>
         </w:rPr>
-        <w:t xml:space="preserve">96 pages including the covers, B5 page size (176 × 250 mm), with 9 parts and 27 chapters, followed by a list of abbreviations, a short list of further reading, a glossary of 110 terms, a list of 38 references and a page with the QR code of the team’s website.</w:t>
+        <w:t xml:space="preserve">98 pages including the covers, B5 page size (176 × 250 mm), with 9 parts and 27 chapters, followed by a list of abbreviations, a short list of further reading, a glossary of 113 terms, a list of 39 references and a page with the QR code of the team’s website.</w:t>
       </w:r>
     </w:p>
     <w:p>
@@ -771,7 +771,7 @@
                 <w:sz w:val="19"/>
                 <w:szCs w:val="19"/>
               </w:rPr>
-              <w:t xml:space="preserve">Terminology_chapter.docx (Masooma’s chapter)</w:t>
+              <w:t xml:space="preserve">Terminology_chapter.docx (selected by Samiuallah and Masooma)</w:t>
             </w:r>
           </w:p>
         </w:tc>

</xml_diff>